<commit_message>
Updated roles and grammer
</commit_message>
<xml_diff>
--- a/content/media/Tushar_Resume.docx
+++ b/content/media/Tushar_Resume.docx
@@ -2047,15 +2047,7 @@
           <w:szCs w:val="22"/>
           <w:lang w:val="en-GB"/>
         </w:rPr>
-        <w:t>Languages</w:t>
-      </w:r>
-      <w:r>
-        <w:rPr>
-          <w:sz w:val="22"/>
-          <w:szCs w:val="22"/>
-          <w:lang w:val="en-GB"/>
-        </w:rPr>
-        <w:t xml:space="preserve"> :</w:t>
+        <w:t>Languages :</w:t>
       </w:r>
       <w:proofErr w:type="gramEnd"/>
     </w:p>
@@ -2127,15 +2119,7 @@
           <w:szCs w:val="22"/>
           <w:lang w:val="en-GB"/>
         </w:rPr>
-        <w:t>Databases</w:t>
-      </w:r>
-      <w:r>
-        <w:rPr>
-          <w:sz w:val="22"/>
-          <w:szCs w:val="22"/>
-          <w:lang w:val="en-GB"/>
-        </w:rPr>
-        <w:t xml:space="preserve"> :</w:t>
+        <w:t>Databases :</w:t>
       </w:r>
       <w:proofErr w:type="gramEnd"/>
     </w:p>
@@ -2997,15 +2981,7 @@
           <w:szCs w:val="20"/>
           <w:lang w:val="en-GB"/>
         </w:rPr>
-        <w:t xml:space="preserve"> </w:t>
-      </w:r>
-      <w:r>
-        <w:rPr>
-          <w:sz w:val="20"/>
-          <w:szCs w:val="20"/>
-          <w:lang w:val="en-GB"/>
-        </w:rPr>
-        <w:t>a unified manner.</w:t>
+        <w:t xml:space="preserve"> a unified manner.</w:t>
       </w:r>
     </w:p>
     <w:p>
@@ -3055,15 +3031,7 @@
           <w:szCs w:val="20"/>
           <w:lang w:val="en-GB"/>
         </w:rPr>
-        <w:t xml:space="preserve">Creating REST </w:t>
-      </w:r>
-      <w:r>
-        <w:rPr>
-          <w:sz w:val="20"/>
-          <w:szCs w:val="20"/>
-          <w:lang w:val="en-GB"/>
-        </w:rPr>
-        <w:t>end</w:t>
+        <w:t>Creating REST end</w:t>
       </w:r>
       <w:r>
         <w:rPr>
@@ -3223,15 +3191,7 @@
           <w:szCs w:val="20"/>
           <w:lang w:val="en-GB"/>
         </w:rPr>
-        <w:t>which helps in visualization</w:t>
-      </w:r>
-      <w:r>
-        <w:rPr>
-          <w:sz w:val="20"/>
-          <w:szCs w:val="20"/>
-          <w:lang w:val="en-GB"/>
-        </w:rPr>
-        <w:t>.</w:t>
+        <w:t>which helps in visualization.</w:t>
       </w:r>
     </w:p>
     <w:p>
@@ -3306,23 +3266,7 @@
           <w:szCs w:val="20"/>
           <w:lang w:val="en-GB"/>
         </w:rPr>
-        <w:t>container</w:t>
-      </w:r>
-      <w:r>
-        <w:rPr>
-          <w:sz w:val="20"/>
-          <w:szCs w:val="20"/>
-          <w:lang w:val="en-GB"/>
-        </w:rPr>
-        <w:t>) and</w:t>
-      </w:r>
-      <w:r>
-        <w:rPr>
-          <w:sz w:val="20"/>
-          <w:szCs w:val="20"/>
-          <w:lang w:val="en-GB"/>
-        </w:rPr>
-        <w:t xml:space="preserve"> added common transformations for easy data</w:t>
+        <w:t>container) and added common transformations for easy data</w:t>
       </w:r>
       <w:r>
         <w:rPr>
@@ -3462,7 +3406,7 @@
           <w:szCs w:val="20"/>
           <w:lang w:val="en-GB"/>
         </w:rPr>
-        <w:t>and deploying micro-services in EKS Clusters.</w:t>
+        <w:t>and deploying microservices in EKS Clusters.</w:t>
       </w:r>
     </w:p>
     <w:p>
@@ -3739,55 +3683,7 @@
           <w:szCs w:val="18"/>
           <w:lang w:val="en-GB"/>
         </w:rPr>
-        <w:t>July</w:t>
-      </w:r>
-      <w:r>
-        <w:rPr>
-          <w:sz w:val="18"/>
-          <w:szCs w:val="18"/>
-          <w:lang w:val="en-GB"/>
-        </w:rPr>
-        <w:t xml:space="preserve"> 20</w:t>
-      </w:r>
-      <w:r>
-        <w:rPr>
-          <w:sz w:val="18"/>
-          <w:szCs w:val="18"/>
-          <w:lang w:val="en-GB"/>
-        </w:rPr>
-        <w:t>15</w:t>
-      </w:r>
-      <w:r>
-        <w:rPr>
-          <w:sz w:val="18"/>
-          <w:szCs w:val="18"/>
-          <w:lang w:val="en-GB"/>
-        </w:rPr>
-        <w:t xml:space="preserve"> </w:t>
-      </w:r>
-      <w:r>
-        <w:rPr>
-          <w:sz w:val="18"/>
-          <w:szCs w:val="18"/>
-          <w:lang w:val="en-GB"/>
-        </w:rPr>
-        <w:t>-</w:t>
-      </w:r>
-      <w:r>
-        <w:rPr>
-          <w:sz w:val="18"/>
-          <w:szCs w:val="18"/>
-          <w:lang w:val="en-GB"/>
-        </w:rPr>
-        <w:t xml:space="preserve"> </w:t>
-      </w:r>
-      <w:r>
-        <w:rPr>
-          <w:sz w:val="18"/>
-          <w:szCs w:val="18"/>
-          <w:lang w:val="en-GB"/>
-        </w:rPr>
-        <w:t>Mar 2021</w:t>
+        <w:t>July 2015 - Mar 2021</w:t>
       </w:r>
     </w:p>
     <w:p>
@@ -3834,23 +3730,7 @@
           <w:szCs w:val="20"/>
           <w:lang w:val="en-GB"/>
         </w:rPr>
-        <w:t xml:space="preserve">This project is a platform which integrates multiple technologies at a single platform for the developers. This follows the approach of all the </w:t>
-      </w:r>
-      <w:r>
-        <w:rPr>
-          <w:sz w:val="20"/>
-          <w:szCs w:val="20"/>
-          <w:lang w:val="en-GB"/>
-        </w:rPr>
-        <w:t>pioneers’</w:t>
-      </w:r>
-      <w:r>
-        <w:rPr>
-          <w:sz w:val="20"/>
-          <w:szCs w:val="20"/>
-          <w:lang w:val="en-GB"/>
-        </w:rPr>
-        <w:t xml:space="preserve"> building blocks: No Code, Low Code, and Pro Code. This will help customers to enhance their productivity. BDP is a platform, which provides multiple modules such as, tech</w:t>
+        <w:t>This project is a platform which integrates multiple technologies at a single platform for the developers. This follows the approach of all the pioneers’ building blocks: No Code, Low Code, and Pro Code. This will help customers to enhance their productivity. BDP is a platform, which provides multiple modules such as, tech</w:t>
       </w:r>
       <w:r>
         <w:rPr>
@@ -3984,7 +3864,39 @@
           <w:szCs w:val="20"/>
           <w:lang w:val="en-GB"/>
         </w:rPr>
-        <w:t>dataflow, design dataflow templates.</w:t>
+        <w:t>data</w:t>
+      </w:r>
+      <w:r>
+        <w:rPr>
+          <w:sz w:val="20"/>
+          <w:szCs w:val="20"/>
+          <w:lang w:val="en-GB"/>
+        </w:rPr>
+        <w:t>-</w:t>
+      </w:r>
+      <w:r>
+        <w:rPr>
+          <w:sz w:val="20"/>
+          <w:szCs w:val="20"/>
+          <w:lang w:val="en-GB"/>
+        </w:rPr>
+        <w:t>flow, design data</w:t>
+      </w:r>
+      <w:r>
+        <w:rPr>
+          <w:sz w:val="20"/>
+          <w:szCs w:val="20"/>
+          <w:lang w:val="en-GB"/>
+        </w:rPr>
+        <w:t>-</w:t>
+      </w:r>
+      <w:r>
+        <w:rPr>
+          <w:sz w:val="20"/>
+          <w:szCs w:val="20"/>
+          <w:lang w:val="en-GB"/>
+        </w:rPr>
+        <w:t>flow templates.</w:t>
       </w:r>
     </w:p>
     <w:p>
@@ -4268,6 +4180,7 @@
       </w:pPr>
       <w:r>
         <w:rPr>
+          <w:noProof/>
           <w:sz w:val="22"/>
           <w:szCs w:val="22"/>
           <w:lang w:val="en-GB"/>
@@ -5153,7 +5066,23 @@
           <w:szCs w:val="20"/>
           <w:lang w:val="en-GB"/>
         </w:rPr>
-        <w:t>Problem Solving</w:t>
+        <w:t>Problem</w:t>
+      </w:r>
+      <w:r>
+        <w:rPr>
+          <w:sz w:val="20"/>
+          <w:szCs w:val="20"/>
+          <w:lang w:val="en-GB"/>
+        </w:rPr>
+        <w:t>-</w:t>
+      </w:r>
+      <w:r>
+        <w:rPr>
+          <w:sz w:val="20"/>
+          <w:szCs w:val="20"/>
+          <w:lang w:val="en-GB"/>
+        </w:rPr>
+        <w:t>Solving</w:t>
       </w:r>
     </w:p>
     <w:p>
@@ -5916,7 +5845,7 @@
           <w:sz w:val="20"/>
           <w:szCs w:val="20"/>
         </w:rPr>
-        <w:t>This project shapes and grooms talent, brings technology and engineering excellence, and provides us an opportunity to help our customers on their transformational initiatives. It also has a new approach to hiring high quality talent. It also included online test integration with third party services, creating amazon workspaces, undergoing various skill- based trainings to uplift the employees</w:t>
+        <w:t>This project shapes and grooms talent, brings technology and engineering excellence, and provides us an opportunity to help our customers on their transformational initiatives. It also has a new approach to hiring high quality talent. It also included online test integration with third party services, creating amazon workspaces, undergoing various skill-based trainings to uplift the employees</w:t>
       </w:r>
       <w:r>
         <w:rPr>
@@ -6180,15 +6109,7 @@
           <w:szCs w:val="20"/>
           <w:lang w:val="en-GB"/>
         </w:rPr>
-        <w:t xml:space="preserve">Eclipse CHE integration to enable users to use a </w:t>
-      </w:r>
-      <w:r>
-        <w:rPr>
-          <w:sz w:val="20"/>
-          <w:szCs w:val="20"/>
-          <w:lang w:val="en-GB"/>
-        </w:rPr>
-        <w:t>cloud-based</w:t>
+        <w:t>Eclipse CHE integration to enable users to use a cloud-based</w:t>
       </w:r>
       <w:r>
         <w:rPr>
@@ -6281,7 +6202,7 @@
           <w:sz w:val="20"/>
           <w:szCs w:val="20"/>
         </w:rPr>
-        <w:t>This project is about creating various API's using Spring Boot and exposing each one of them as a different service. All the services are managed through a gateway channel, and the REST services are invoked via Swagger</w:t>
+        <w:t>This project is about creating various APIs using Spring Boot and exposing each one of them as a different service. All the services are managed through a gateway channel, and the REST services are invoked via Swagger</w:t>
       </w:r>
       <w:r>
         <w:rPr>
@@ -6337,15 +6258,7 @@
           <w:szCs w:val="20"/>
           <w:lang w:val="en-GB"/>
         </w:rPr>
-        <w:t>RESTful</w:t>
-      </w:r>
-      <w:r>
-        <w:rPr>
-          <w:sz w:val="20"/>
-          <w:szCs w:val="20"/>
-          <w:lang w:val="en-GB"/>
-        </w:rPr>
-        <w:t xml:space="preserve"> Services</w:t>
+        <w:t>RESTful Services</w:t>
       </w:r>
     </w:p>
     <w:p>
@@ -6429,7 +6342,23 @@
           <w:szCs w:val="20"/>
           <w:lang w:val="en-GB"/>
         </w:rPr>
-        <w:t>Writing end services for spring cloud dataflow microservices.</w:t>
+        <w:t>Writing end services for spring cloud data</w:t>
+      </w:r>
+      <w:r>
+        <w:rPr>
+          <w:sz w:val="20"/>
+          <w:szCs w:val="20"/>
+          <w:lang w:val="en-GB"/>
+        </w:rPr>
+        <w:t>-</w:t>
+      </w:r>
+      <w:r>
+        <w:rPr>
+          <w:sz w:val="20"/>
+          <w:szCs w:val="20"/>
+          <w:lang w:val="en-GB"/>
+        </w:rPr>
+        <w:t>flow microservices.</w:t>
       </w:r>
     </w:p>
     <w:p>
@@ -6628,63 +6557,7 @@
           <w:sz w:val="20"/>
           <w:szCs w:val="20"/>
         </w:rPr>
-        <w:t xml:space="preserve">This project is about creating a code generator in almost every possible language to </w:t>
-      </w:r>
-      <w:r>
-        <w:rPr>
-          <w:sz w:val="20"/>
-          <w:szCs w:val="20"/>
-        </w:rPr>
-        <w:t>at least</w:t>
-      </w:r>
-      <w:r>
-        <w:rPr>
-          <w:sz w:val="20"/>
-          <w:szCs w:val="20"/>
-        </w:rPr>
-        <w:t xml:space="preserve"> setup the base structure before creating an application. This will also support multiple databases as </w:t>
-      </w:r>
-      <w:r>
-        <w:rPr>
-          <w:sz w:val="20"/>
-          <w:szCs w:val="20"/>
-        </w:rPr>
-        <w:t>MySQL</w:t>
-      </w:r>
-      <w:r>
-        <w:rPr>
-          <w:sz w:val="20"/>
-          <w:szCs w:val="20"/>
-        </w:rPr>
-        <w:t xml:space="preserve">, </w:t>
-      </w:r>
-      <w:r>
-        <w:rPr>
-          <w:sz w:val="20"/>
-          <w:szCs w:val="20"/>
-        </w:rPr>
-        <w:t>Postgres</w:t>
-      </w:r>
-      <w:r>
-        <w:rPr>
-          <w:sz w:val="20"/>
-          <w:szCs w:val="20"/>
-        </w:rPr>
-        <w:t xml:space="preserve">, mongo, neo4j, etc. It will also include CI &amp; CD process to directly integrate with </w:t>
-      </w:r>
-      <w:r>
-        <w:rPr>
-          <w:sz w:val="20"/>
-          <w:szCs w:val="20"/>
-        </w:rPr>
-        <w:t>GitHub</w:t>
-      </w:r>
-      <w:r>
-        <w:rPr>
-          <w:sz w:val="20"/>
-          <w:szCs w:val="20"/>
-        </w:rPr>
-        <w:t xml:space="preserve"> and deploy in a server for its use</w:t>
+        <w:t>This project is about creating a code generator in almost every possible language to at least setup the base structure before creating an application. This will also support multiple databases as MySQL, Postgres, mongo, neo4j, etc. It will also include CI &amp; CD process to directly integrate with GitHub and deploy in a server for its use</w:t>
       </w:r>
       <w:r>
         <w:rPr>
@@ -6791,23 +6664,7 @@
           <w:szCs w:val="20"/>
           <w:lang w:val="en-GB"/>
         </w:rPr>
-        <w:t xml:space="preserve">end view using </w:t>
-      </w:r>
-      <w:r>
-        <w:rPr>
-          <w:sz w:val="20"/>
-          <w:szCs w:val="20"/>
-          <w:lang w:val="en-GB"/>
-        </w:rPr>
-        <w:t>template-based</w:t>
-      </w:r>
-      <w:r>
-        <w:rPr>
-          <w:sz w:val="20"/>
-          <w:szCs w:val="20"/>
-          <w:lang w:val="en-GB"/>
-        </w:rPr>
-        <w:t xml:space="preserve"> architecture.</w:t>
+        <w:t>end view using template-based architecture.</w:t>
       </w:r>
     </w:p>
     <w:p>
@@ -9407,6 +9264,7 @@
   <w:style w:type="character" w:default="1" w:styleId="DefaultParagraphFont">
     <w:name w:val="Default Paragraph Font"/>
     <w:uiPriority w:val="1"/>
+    <w:semiHidden/>
     <w:unhideWhenUsed/>
   </w:style>
   <w:style w:type="table" w:default="1" w:styleId="TableNormal">

</xml_diff>